<commit_message>
fix(templates,export): Biên nhận dùng {tenNguoiIn} + guard huỷ khi tách file (codex)
- HIGH: BIEN_NHAN vẫn dùng {tenCanBoDeXuat} — biến này nay ưu tiên cán bộ CHỌN
  trên form nên Giấy biên nhận sẽ in SAI người giao (phải là người trực tiếp
  nhận đơn). Đổi mẫu sang {tenNguoiIn} (luôn = người đăng nhập) cho cả dòng
  'Tôi:' và ô NGƯỜI GIAO. Test khoá: BIEN_NHAN KHÔNG được chứa tenCanBoDeXuat.
- MEDIUM: chế độ tách nhiều file thiếu guard huỷ — đóng modal giữa chừng vẫn tải
  tiếp các file còn lại và setState sau unmount. Thêm cancelledRef: dừng vòng lặp
  + bỏ qua mọi setState/onClose sau khi modal đóng.

Co-Authored-By: Claude Opus 4.8 (1M context) <noreply@anthropic.com>
</commit_message>
<xml_diff>
--- a/backend/prisma/seed-assets/petition-docx/BIEN_NHAN.docx
+++ b/backend/prisma/seed-assets/petition-docx/BIEN_NHAN.docx
@@ -1152,7 +1152,7 @@
           <w:color w:val="000000"/>
           <w:spacing w:val="-2"/>
         </w:rPr>
-        <w:t>{tenCanBoDeXuat}</w:t>
+        <w:t>{tenNguoiIn}</w:t>
       </w:r>
     </w:p>
     <w:p>
@@ -3267,7 +3267,7 @@
                 <w:color w:val="000000"/>
                 <w:spacing w:val="-2"/>
               </w:rPr>
-              <w:t>{tenCanBoDeXuat}</w:t>
+              <w:t>{tenNguoiIn}</w:t>
             </w:r>
           </w:p>
         </w:tc>

</xml_diff>